<commit_message>
add project link to report file
</commit_message>
<xml_diff>
--- a/report.docx
+++ b/report.docx
@@ -502,7 +502,6 @@
         <w:t xml:space="preserve">The loop uses </w:t>
       </w:r>
       <w:proofErr w:type="spellStart"/>
-      <w:proofErr w:type="gramStart"/>
       <w:r>
         <w:rPr>
           <w:rFonts w:ascii="Times New Roman" w:hAnsi="Times New Roman" w:cs="Times New Roman"/>
@@ -516,31 +515,7 @@
           <w:rFonts w:ascii="Times New Roman" w:hAnsi="Times New Roman" w:cs="Times New Roman"/>
           <w:sz w:val="22"/>
         </w:rPr>
-        <w:t>(</w:t>
-      </w:r>
-      <w:proofErr w:type="gramEnd"/>
-      <w:r>
-        <w:rPr>
-          <w:rFonts w:ascii="Times New Roman" w:hAnsi="Times New Roman" w:cs="Times New Roman"/>
-          <w:sz w:val="22"/>
-        </w:rPr>
-        <w:t xml:space="preserve">) for sampling, buttons, serial, the buzzer, and the OLED. If both limits are </w:t>
-      </w:r>
-      <w:proofErr w:type="gramStart"/>
-      <w:r>
-        <w:rPr>
-          <w:rFonts w:ascii="Times New Roman" w:hAnsi="Times New Roman" w:cs="Times New Roman"/>
-          <w:sz w:val="22"/>
-        </w:rPr>
-        <w:t>crossed</w:t>
-      </w:r>
-      <w:proofErr w:type="gramEnd"/>
-      <w:r>
-        <w:rPr>
-          <w:rFonts w:ascii="Times New Roman" w:hAnsi="Times New Roman" w:cs="Times New Roman"/>
-          <w:sz w:val="22"/>
-        </w:rPr>
-        <w:t xml:space="preserve"> I log over-voltage first. Buttons and serial write the same four settings. A number outside the range is ignored. Reset is refused while the fault is still there.</w:t>
+        <w:t>() for sampling, buttons, serial, the buzzer, and the OLED. If both limits are crossed I log over-voltage first. Buttons and serial write the same four settings. A number outside the range is ignored. Reset is refused while the fault is still there.</w:t>
       </w:r>
     </w:p>
     <w:p>
@@ -1368,6 +1343,24 @@
         </w:rPr>
         <w:t>.</w:t>
       </w:r>
+      <w:r>
+        <w:rPr>
+          <w:rFonts w:ascii="Times New Roman" w:hAnsi="Times New Roman" w:cs="Times New Roman"/>
+          <w:sz w:val="22"/>
+        </w:rPr>
+        <w:br/>
+        <w:t xml:space="preserve">My project Link: </w:t>
+      </w:r>
+      <w:hyperlink r:id="rId4" w:history="1">
+        <w:r>
+          <w:rPr>
+            <w:rStyle w:val="Hyperlink"/>
+            <w:rFonts w:ascii="Times New Roman" w:hAnsi="Times New Roman" w:cs="Times New Roman"/>
+            <w:sz w:val="22"/>
+          </w:rPr>
+          <w:t>https://wokwi.com/projects/477505593298122753</w:t>
+        </w:r>
+      </w:hyperlink>
     </w:p>
     <w:sectPr>
       <w:pgSz w:w="12240" w:h="15840"/>
@@ -1982,6 +1975,7 @@
   <w:style w:type="character" w:default="1" w:styleId="DefaultParagraphFont">
     <w:name w:val="Default Paragraph Font"/>
     <w:uiPriority w:val="1"/>
+    <w:semiHidden/>
     <w:unhideWhenUsed/>
   </w:style>
   <w:style w:type="table" w:default="1" w:styleId="TableNormal">
@@ -2313,6 +2307,29 @@
         <w:insideV w:val="single" w:sz="4" w:space="0" w:color="auto"/>
       </w:tblBorders>
     </w:tblPr>
+  </w:style>
+  <w:style w:type="character" w:styleId="Hyperlink">
+    <w:name w:val="Hyperlink"/>
+    <w:basedOn w:val="DefaultParagraphFont"/>
+    <w:uiPriority w:val="99"/>
+    <w:unhideWhenUsed/>
+    <w:rsid w:val="00C51580"/>
+    <w:rPr>
+      <w:color w:val="0563C1" w:themeColor="hyperlink"/>
+      <w:u w:val="single"/>
+    </w:rPr>
+  </w:style>
+  <w:style w:type="character" w:styleId="UnresolvedMention">
+    <w:name w:val="Unresolved Mention"/>
+    <w:basedOn w:val="DefaultParagraphFont"/>
+    <w:uiPriority w:val="99"/>
+    <w:semiHidden/>
+    <w:unhideWhenUsed/>
+    <w:rsid w:val="00C51580"/>
+    <w:rPr>
+      <w:color w:val="605E5C"/>
+      <w:shd w:val="clear" w:color="auto" w:fill="E1DFDD"/>
+    </w:rPr>
   </w:style>
 </w:styles>
 </file>

</xml_diff>